<commit_message>
Docs de observación indirecta y lectura de placas: ejemplos consultados y lector propio
Co-Authored-By: Claude Sonnet 5.5 <noreply@anthropic.com>
Claude-Session: https://claude.ai/code/session_01WLZ2XuhTWTWujj27otXiLx
</commit_message>
<xml_diff>
--- a/docs/documentos/03 Observación Indirecta.docx
+++ b/docs/documentos/03 Observación Indirecta.docx
@@ -1415,7 +1415,7 @@
                 <w:i w:val="0"/>
                 <w:sz w:val="18"/>
               </w:rPr>
-              <w:t>Herramientas de lectura de placas</w:t>
+              <w:t>Herramientas de lectura de placas y tutoriales de OCR</w:t>
             </w:r>
           </w:p>
         </w:tc>
@@ -1471,7 +1471,7 @@
                 <w:i w:val="0"/>
                 <w:sz w:val="18"/>
               </w:rPr>
-              <w:t>No se implementó; queda como mejora futura</w:t>
+              <w:t>Lector de placas del sistema Python (EasyOCR, con Tesseract como respaldo), probado con la lógica de lectura y pendiente de probar con cámara real</w:t>
             </w:r>
           </w:p>
         </w:tc>
@@ -1678,6 +1678,631 @@
           <w:sz w:val="20"/>
         </w:rPr>
         <w:t>Elaboración propia.</w:t>
+      </w:r>
+    </w:p>
+    <w:p>
+      <w:pPr>
+        <w:keepNext/>
+        <w:widowControl/>
+        <w:spacing w:lineRule="auto" w:line="480" w:before="0" w:after="0"/>
+        <w:jc w:val="center"/>
+      </w:pPr>
+      <w:r>
+        <w:rPr>
+          <w:rFonts w:ascii="Times New Roman" w:hAnsi="Times New Roman" w:cs="Times New Roman" w:eastAsia="Times New Roman"/>
+          <w:b/>
+          <w:i w:val="0"/>
+          <w:sz w:val="24"/>
+        </w:rPr>
+        <w:t>Ejemplos consultados</w:t>
+      </w:r>
+    </w:p>
+    <w:p>
+      <w:pPr>
+        <w:keepNext/>
+        <w:widowControl/>
+        <w:spacing w:lineRule="auto" w:line="480" w:before="0" w:after="0"/>
+        <w:jc w:val="left"/>
+      </w:pPr>
+      <w:r>
+        <w:rPr>
+          <w:rFonts w:ascii="Times New Roman" w:hAnsi="Times New Roman" w:cs="Times New Roman" w:eastAsia="Times New Roman"/>
+          <w:b/>
+          <w:i w:val="0"/>
+          <w:sz w:val="24"/>
+        </w:rPr>
+        <w:t>Tabla 3</w:t>
+      </w:r>
+    </w:p>
+    <w:p>
+      <w:pPr>
+        <w:keepNext/>
+        <w:widowControl/>
+        <w:spacing w:lineRule="auto" w:line="480" w:before="0" w:after="0"/>
+        <w:jc w:val="left"/>
+      </w:pPr>
+      <w:r>
+        <w:rPr>
+          <w:rFonts w:ascii="Times New Roman" w:hAnsi="Times New Roman" w:cs="Times New Roman" w:eastAsia="Times New Roman"/>
+          <w:b w:val="0"/>
+          <w:i/>
+          <w:sz w:val="24"/>
+        </w:rPr>
+        <w:t>Páginas y tutoriales de referencia</w:t>
+      </w:r>
+    </w:p>
+    <w:tbl>
+      <w:tblPr>
+        <w:jc w:val="center"/>
+        <w:tblLayout w:type="fixed"/>
+        <w:tblLook w:firstColumn="1" w:firstRow="1" w:lastColumn="0" w:lastRow="0" w:noHBand="0" w:noVBand="1" w:val="04A0"/>
+        <w:tblLayout w:type="fixed"/>
+        <w:tblW w:w="9360" w:type="dxa"/>
+      </w:tblPr>
+      <w:tblGrid>
+        <w:gridCol w:w="3311"/>
+        <w:gridCol w:w="3456"/>
+        <w:gridCol w:w="2592"/>
+      </w:tblGrid>
+      <w:tr>
+        <w:trPr>
+          <w:tblHeader w:val="true"/>
+          <w:cantSplit w:val="true"/>
+        </w:trPr>
+        <w:tc>
+          <w:tcPr>
+            <w:tcW w:type="dxa" w:w="3312"/>
+            <w:tcBorders>
+              <w:top w:val="single" w:sz="8" w:color="000000" w:space="0"/>
+              <w:left w:val="nil"/>
+              <w:bottom w:val="single" w:sz="6" w:color="000000" w:space="0"/>
+              <w:right w:val="nil"/>
+            </w:tcBorders>
+          </w:tcPr>
+          <w:p>
+            <w:pPr>
+              <w:keepNext w:val="0"/>
+              <w:widowControl/>
+              <w:spacing w:lineRule="auto" w:line="240" w:before="40" w:after="40"/>
+              <w:jc w:val="left"/>
+            </w:pPr>
+            <w:r>
+              <w:rPr>
+                <w:rFonts w:ascii="Times New Roman" w:hAnsi="Times New Roman" w:cs="Times New Roman" w:eastAsia="Times New Roman"/>
+                <w:b/>
+                <w:i w:val="0"/>
+                <w:sz w:val="18"/>
+              </w:rPr>
+              <w:t>Ejemplo</w:t>
+            </w:r>
+          </w:p>
+        </w:tc>
+        <w:tc>
+          <w:tcPr>
+            <w:tcW w:type="dxa" w:w="3456"/>
+            <w:tcBorders>
+              <w:top w:val="single" w:sz="8" w:color="000000" w:space="0"/>
+              <w:left w:val="nil"/>
+              <w:bottom w:val="single" w:sz="6" w:color="000000" w:space="0"/>
+              <w:right w:val="nil"/>
+            </w:tcBorders>
+          </w:tcPr>
+          <w:p>
+            <w:pPr>
+              <w:keepNext w:val="0"/>
+              <w:widowControl/>
+              <w:spacing w:lineRule="auto" w:line="240" w:before="40" w:after="40"/>
+              <w:jc w:val="left"/>
+            </w:pPr>
+            <w:r>
+              <w:rPr>
+                <w:rFonts w:ascii="Times New Roman" w:hAnsi="Times New Roman" w:cs="Times New Roman" w:eastAsia="Times New Roman"/>
+                <w:b/>
+                <w:i w:val="0"/>
+                <w:sz w:val="18"/>
+              </w:rPr>
+              <w:t>Qué muestra</w:t>
+            </w:r>
+          </w:p>
+        </w:tc>
+        <w:tc>
+          <w:tcPr>
+            <w:tcW w:type="dxa" w:w="2592"/>
+            <w:tcBorders>
+              <w:top w:val="single" w:sz="8" w:color="000000" w:space="0"/>
+              <w:left w:val="nil"/>
+              <w:bottom w:val="single" w:sz="6" w:color="000000" w:space="0"/>
+              <w:right w:val="nil"/>
+            </w:tcBorders>
+          </w:tcPr>
+          <w:p>
+            <w:pPr>
+              <w:keepNext w:val="0"/>
+              <w:widowControl/>
+              <w:spacing w:lineRule="auto" w:line="240" w:before="40" w:after="40"/>
+              <w:jc w:val="left"/>
+            </w:pPr>
+            <w:r>
+              <w:rPr>
+                <w:rFonts w:ascii="Times New Roman" w:hAnsi="Times New Roman" w:cs="Times New Roman" w:eastAsia="Times New Roman"/>
+                <w:b/>
+                <w:i w:val="0"/>
+                <w:sz w:val="18"/>
+              </w:rPr>
+              <w:t>Qué se aprovechó</w:t>
+            </w:r>
+          </w:p>
+        </w:tc>
+      </w:tr>
+      <w:tr>
+        <w:trPr>
+          <w:cantSplit w:val="true"/>
+        </w:trPr>
+        <w:tc>
+          <w:tcPr>
+            <w:tcW w:type="dxa" w:w="3312"/>
+            <w:tcBorders>
+              <w:top w:val="single" w:sz="6" w:color="000000" w:space="0"/>
+              <w:left w:val="nil"/>
+              <w:bottom w:val="nil"/>
+              <w:right w:val="nil"/>
+            </w:tcBorders>
+          </w:tcPr>
+          <w:p>
+            <w:pPr>
+              <w:keepNext w:val="0"/>
+              <w:widowControl/>
+              <w:spacing w:lineRule="auto" w:line="240" w:before="40" w:after="40"/>
+              <w:jc w:val="left"/>
+            </w:pPr>
+            <w:r>
+              <w:rPr>
+                <w:rFonts w:ascii="Times New Roman" w:hAnsi="Times New Roman" w:cs="Times New Roman" w:eastAsia="Times New Roman"/>
+                <w:b w:val="0"/>
+                <w:i w:val="0"/>
+                <w:sz w:val="18"/>
+              </w:rPr>
+              <w:t>Arduino Getting Started, tutorial «RFID/NFC - Servo Motor»</w:t>
+            </w:r>
+          </w:p>
+        </w:tc>
+        <w:tc>
+          <w:tcPr>
+            <w:tcW w:type="dxa" w:w="3456"/>
+            <w:tcBorders>
+              <w:top w:val="single" w:sz="6" w:color="000000" w:space="0"/>
+              <w:left w:val="nil"/>
+              <w:bottom w:val="nil"/>
+              <w:right w:val="nil"/>
+            </w:tcBorders>
+          </w:tcPr>
+          <w:p>
+            <w:pPr>
+              <w:keepNext w:val="0"/>
+              <w:widowControl/>
+              <w:spacing w:lineRule="auto" w:line="240" w:before="40" w:after="40"/>
+              <w:jc w:val="left"/>
+            </w:pPr>
+            <w:r>
+              <w:rPr>
+                <w:rFonts w:ascii="Times New Roman" w:hAnsi="Times New Roman" w:cs="Times New Roman" w:eastAsia="Times New Roman"/>
+                <w:b w:val="0"/>
+                <w:i w:val="0"/>
+                <w:sz w:val="18"/>
+              </w:rPr>
+              <w:t>Código y cableado para abrir un servo con una etiqueta RFID autorizada (la página no incluye video)</w:t>
+            </w:r>
+          </w:p>
+        </w:tc>
+        <w:tc>
+          <w:tcPr>
+            <w:tcW w:type="dxa" w:w="2592"/>
+            <w:tcBorders>
+              <w:top w:val="single" w:sz="6" w:color="000000" w:space="0"/>
+              <w:left w:val="nil"/>
+              <w:bottom w:val="nil"/>
+              <w:right w:val="nil"/>
+            </w:tcBorders>
+          </w:tcPr>
+          <w:p>
+            <w:pPr>
+              <w:keepNext w:val="0"/>
+              <w:widowControl/>
+              <w:spacing w:lineRule="auto" w:line="240" w:before="40" w:after="40"/>
+              <w:jc w:val="left"/>
+            </w:pPr>
+            <w:r>
+              <w:rPr>
+                <w:rFonts w:ascii="Times New Roman" w:hAnsi="Times New Roman" w:cs="Times New Roman" w:eastAsia="Times New Roman"/>
+                <w:b w:val="0"/>
+                <w:i w:val="0"/>
+                <w:sz w:val="18"/>
+              </w:rPr>
+              <w:t>Lógica del prototipo Arduino</w:t>
+            </w:r>
+          </w:p>
+        </w:tc>
+      </w:tr>
+      <w:tr>
+        <w:trPr>
+          <w:cantSplit w:val="true"/>
+        </w:trPr>
+        <w:tc>
+          <w:tcPr>
+            <w:tcW w:type="dxa" w:w="3312"/>
+            <w:tcBorders>
+              <w:top w:val="nil"/>
+              <w:left w:val="nil"/>
+              <w:bottom w:val="nil"/>
+              <w:right w:val="nil"/>
+            </w:tcBorders>
+          </w:tcPr>
+          <w:p>
+            <w:pPr>
+              <w:keepNext w:val="0"/>
+              <w:widowControl/>
+              <w:spacing w:lineRule="auto" w:line="240" w:before="40" w:after="40"/>
+              <w:jc w:val="left"/>
+            </w:pPr>
+            <w:r>
+              <w:rPr>
+                <w:rFonts w:ascii="Times New Roman" w:hAnsi="Times New Roman" w:cs="Times New Roman" w:eastAsia="Times New Roman"/>
+                <w:b w:val="0"/>
+                <w:i w:val="0"/>
+                <w:sz w:val="18"/>
+              </w:rPr>
+              <w:t>Electronic Clinic, «Arduino RFID Servo Motor Control system for Car Parking»</w:t>
+            </w:r>
+          </w:p>
+        </w:tc>
+        <w:tc>
+          <w:tcPr>
+            <w:tcW w:type="dxa" w:w="3456"/>
+            <w:tcBorders>
+              <w:top w:val="nil"/>
+              <w:left w:val="nil"/>
+              <w:bottom w:val="nil"/>
+              <w:right w:val="nil"/>
+            </w:tcBorders>
+          </w:tcPr>
+          <w:p>
+            <w:pPr>
+              <w:keepNext w:val="0"/>
+              <w:widowControl/>
+              <w:spacing w:lineRule="auto" w:line="240" w:before="40" w:after="40"/>
+              <w:jc w:val="left"/>
+            </w:pPr>
+            <w:r>
+              <w:rPr>
+                <w:rFonts w:ascii="Times New Roman" w:hAnsi="Times New Roman" w:cs="Times New Roman" w:eastAsia="Times New Roman"/>
+                <w:b w:val="0"/>
+                <w:i w:val="0"/>
+                <w:sz w:val="18"/>
+              </w:rPr>
+              <w:t>Proyecto de parqueadero con RFID y servo</w:t>
+            </w:r>
+          </w:p>
+        </w:tc>
+        <w:tc>
+          <w:tcPr>
+            <w:tcW w:type="dxa" w:w="2592"/>
+            <w:tcBorders>
+              <w:top w:val="nil"/>
+              <w:left w:val="nil"/>
+              <w:bottom w:val="nil"/>
+              <w:right w:val="nil"/>
+            </w:tcBorders>
+          </w:tcPr>
+          <w:p>
+            <w:pPr>
+              <w:keepNext w:val="0"/>
+              <w:widowControl/>
+              <w:spacing w:lineRule="auto" w:line="240" w:before="40" w:after="40"/>
+              <w:jc w:val="left"/>
+            </w:pPr>
+            <w:r>
+              <w:rPr>
+                <w:rFonts w:ascii="Times New Roman" w:hAnsi="Times New Roman" w:cs="Times New Roman" w:eastAsia="Times New Roman"/>
+                <w:b w:val="0"/>
+                <w:i w:val="0"/>
+                <w:sz w:val="18"/>
+              </w:rPr>
+              <w:t>Ejemplo de barrera de parqueadero</w:t>
+            </w:r>
+          </w:p>
+        </w:tc>
+      </w:tr>
+      <w:tr>
+        <w:trPr>
+          <w:cantSplit w:val="true"/>
+        </w:trPr>
+        <w:tc>
+          <w:tcPr>
+            <w:tcW w:type="dxa" w:w="3312"/>
+            <w:tcBorders>
+              <w:top w:val="nil"/>
+              <w:left w:val="nil"/>
+              <w:bottom w:val="nil"/>
+              <w:right w:val="nil"/>
+            </w:tcBorders>
+          </w:tcPr>
+          <w:p>
+            <w:pPr>
+              <w:keepNext w:val="0"/>
+              <w:widowControl/>
+              <w:spacing w:lineRule="auto" w:line="240" w:before="40" w:after="40"/>
+              <w:jc w:val="left"/>
+            </w:pPr>
+            <w:r>
+              <w:rPr>
+                <w:rFonts w:ascii="Times New Roman" w:hAnsi="Times New Roman" w:cs="Times New Roman" w:eastAsia="Times New Roman"/>
+                <w:b w:val="0"/>
+                <w:i w:val="0"/>
+                <w:sz w:val="18"/>
+              </w:rPr>
+              <w:t>Repositorio computervisioneng/automatic-number-plate-recognition-python-yolov8 (GitHub)</w:t>
+            </w:r>
+          </w:p>
+        </w:tc>
+        <w:tc>
+          <w:tcPr>
+            <w:tcW w:type="dxa" w:w="3456"/>
+            <w:tcBorders>
+              <w:top w:val="nil"/>
+              <w:left w:val="nil"/>
+              <w:bottom w:val="nil"/>
+              <w:right w:val="nil"/>
+            </w:tcBorders>
+          </w:tcPr>
+          <w:p>
+            <w:pPr>
+              <w:keepNext w:val="0"/>
+              <w:widowControl/>
+              <w:spacing w:lineRule="auto" w:line="240" w:before="40" w:after="40"/>
+              <w:jc w:val="left"/>
+            </w:pPr>
+            <w:r>
+              <w:rPr>
+                <w:rFonts w:ascii="Times New Roman" w:hAnsi="Times New Roman" w:cs="Times New Roman" w:eastAsia="Times New Roman"/>
+                <w:b w:val="0"/>
+                <w:i w:val="0"/>
+                <w:sz w:val="18"/>
+              </w:rPr>
+              <w:t>Código de un sistema de lectura de placas en Python que acompaña un tutorial en video</w:t>
+            </w:r>
+          </w:p>
+        </w:tc>
+        <w:tc>
+          <w:tcPr>
+            <w:tcW w:type="dxa" w:w="2592"/>
+            <w:tcBorders>
+              <w:top w:val="nil"/>
+              <w:left w:val="nil"/>
+              <w:bottom w:val="nil"/>
+              <w:right w:val="nil"/>
+            </w:tcBorders>
+          </w:tcPr>
+          <w:p>
+            <w:pPr>
+              <w:keepNext w:val="0"/>
+              <w:widowControl/>
+              <w:spacing w:lineRule="auto" w:line="240" w:before="40" w:after="40"/>
+              <w:jc w:val="left"/>
+            </w:pPr>
+            <w:r>
+              <w:rPr>
+                <w:rFonts w:ascii="Times New Roman" w:hAnsi="Times New Roman" w:cs="Times New Roman" w:eastAsia="Times New Roman"/>
+                <w:b w:val="0"/>
+                <w:i w:val="0"/>
+                <w:sz w:val="18"/>
+              </w:rPr>
+              <w:t>Referencia para el lector de placas</w:t>
+            </w:r>
+          </w:p>
+        </w:tc>
+      </w:tr>
+      <w:tr>
+        <w:trPr>
+          <w:cantSplit w:val="true"/>
+        </w:trPr>
+        <w:tc>
+          <w:tcPr>
+            <w:tcW w:type="dxa" w:w="3312"/>
+            <w:tcBorders>
+              <w:top w:val="nil"/>
+              <w:left w:val="nil"/>
+              <w:bottom w:val="nil"/>
+              <w:right w:val="nil"/>
+            </w:tcBorders>
+          </w:tcPr>
+          <w:p>
+            <w:pPr>
+              <w:keepNext w:val="0"/>
+              <w:widowControl/>
+              <w:spacing w:lineRule="auto" w:line="240" w:before="40" w:after="40"/>
+              <w:jc w:val="left"/>
+            </w:pPr>
+            <w:r>
+              <w:rPr>
+                <w:rFonts w:ascii="Times New Roman" w:hAnsi="Times New Roman" w:cs="Times New Roman" w:eastAsia="Times New Roman"/>
+                <w:b w:val="0"/>
+                <w:i w:val="0"/>
+                <w:sz w:val="18"/>
+              </w:rPr>
+              <w:t>Class Central, «Automatic Number Plate Recognition Using Tensorflow and EasyOCR - Python»</w:t>
+            </w:r>
+          </w:p>
+        </w:tc>
+        <w:tc>
+          <w:tcPr>
+            <w:tcW w:type="dxa" w:w="3456"/>
+            <w:tcBorders>
+              <w:top w:val="nil"/>
+              <w:left w:val="nil"/>
+              <w:bottom w:val="nil"/>
+              <w:right w:val="nil"/>
+            </w:tcBorders>
+          </w:tcPr>
+          <w:p>
+            <w:pPr>
+              <w:keepNext w:val="0"/>
+              <w:widowControl/>
+              <w:spacing w:lineRule="auto" w:line="240" w:before="40" w:after="40"/>
+              <w:jc w:val="left"/>
+            </w:pPr>
+            <w:r>
+              <w:rPr>
+                <w:rFonts w:ascii="Times New Roman" w:hAnsi="Times New Roman" w:cs="Times New Roman" w:eastAsia="Times New Roman"/>
+                <w:b w:val="0"/>
+                <w:i w:val="0"/>
+                <w:sz w:val="18"/>
+              </w:rPr>
+              <w:t>Clase en video que enseña a detectar y leer placas con EasyOCR</w:t>
+            </w:r>
+          </w:p>
+        </w:tc>
+        <w:tc>
+          <w:tcPr>
+            <w:tcW w:type="dxa" w:w="2592"/>
+            <w:tcBorders>
+              <w:top w:val="nil"/>
+              <w:left w:val="nil"/>
+              <w:bottom w:val="nil"/>
+              <w:right w:val="nil"/>
+            </w:tcBorders>
+          </w:tcPr>
+          <w:p>
+            <w:pPr>
+              <w:keepNext w:val="0"/>
+              <w:widowControl/>
+              <w:spacing w:lineRule="auto" w:line="240" w:before="40" w:after="40"/>
+              <w:jc w:val="left"/>
+            </w:pPr>
+            <w:r>
+              <w:rPr>
+                <w:rFonts w:ascii="Times New Roman" w:hAnsi="Times New Roman" w:cs="Times New Roman" w:eastAsia="Times New Roman"/>
+                <w:b w:val="0"/>
+                <w:i w:val="0"/>
+                <w:sz w:val="18"/>
+              </w:rPr>
+              <w:t>Referencia para el lector de placas</w:t>
+            </w:r>
+          </w:p>
+        </w:tc>
+      </w:tr>
+      <w:tr>
+        <w:trPr>
+          <w:cantSplit w:val="true"/>
+        </w:trPr>
+        <w:tc>
+          <w:tcPr>
+            <w:tcW w:type="dxa" w:w="3312"/>
+            <w:tcBorders>
+              <w:top w:val="nil"/>
+              <w:left w:val="nil"/>
+              <w:bottom w:val="single" w:sz="8" w:color="000000" w:space="0"/>
+              <w:right w:val="nil"/>
+            </w:tcBorders>
+          </w:tcPr>
+          <w:p>
+            <w:pPr>
+              <w:keepNext w:val="0"/>
+              <w:widowControl/>
+              <w:spacing w:lineRule="auto" w:line="240" w:before="40" w:after="40"/>
+              <w:jc w:val="left"/>
+            </w:pPr>
+            <w:r>
+              <w:rPr>
+                <w:rFonts w:ascii="Times New Roman" w:hAnsi="Times New Roman" w:cs="Times New Roman" w:eastAsia="Times New Roman"/>
+                <w:b w:val="0"/>
+                <w:i w:val="0"/>
+                <w:sz w:val="18"/>
+              </w:rPr>
+              <w:t>Hikvision, blog sobre innovaciones en la gestión del control de acceso vehicular</w:t>
+            </w:r>
+          </w:p>
+        </w:tc>
+        <w:tc>
+          <w:tcPr>
+            <w:tcW w:type="dxa" w:w="3456"/>
+            <w:tcBorders>
+              <w:top w:val="nil"/>
+              <w:left w:val="nil"/>
+              <w:bottom w:val="single" w:sz="8" w:color="000000" w:space="0"/>
+              <w:right w:val="nil"/>
+            </w:tcBorders>
+          </w:tcPr>
+          <w:p>
+            <w:pPr>
+              <w:keepNext w:val="0"/>
+              <w:widowControl/>
+              <w:spacing w:lineRule="auto" w:line="240" w:before="40" w:after="40"/>
+              <w:jc w:val="left"/>
+            </w:pPr>
+            <w:r>
+              <w:rPr>
+                <w:rFonts w:ascii="Times New Roman" w:hAnsi="Times New Roman" w:cs="Times New Roman" w:eastAsia="Times New Roman"/>
+                <w:b w:val="0"/>
+                <w:i w:val="0"/>
+                <w:sz w:val="18"/>
+              </w:rPr>
+              <w:t>Descripción de soluciones comerciales de acceso vehicular</w:t>
+            </w:r>
+          </w:p>
+        </w:tc>
+        <w:tc>
+          <w:tcPr>
+            <w:tcW w:type="dxa" w:w="2592"/>
+            <w:tcBorders>
+              <w:top w:val="nil"/>
+              <w:left w:val="nil"/>
+              <w:bottom w:val="single" w:sz="8" w:color="000000" w:space="0"/>
+              <w:right w:val="nil"/>
+            </w:tcBorders>
+          </w:tcPr>
+          <w:p>
+            <w:pPr>
+              <w:keepNext w:val="0"/>
+              <w:widowControl/>
+              <w:spacing w:lineRule="auto" w:line="240" w:before="40" w:after="40"/>
+              <w:jc w:val="left"/>
+            </w:pPr>
+            <w:r>
+              <w:rPr>
+                <w:rFonts w:ascii="Times New Roman" w:hAnsi="Times New Roman" w:cs="Times New Roman" w:eastAsia="Times New Roman"/>
+                <w:b w:val="0"/>
+                <w:i w:val="0"/>
+                <w:sz w:val="18"/>
+              </w:rPr>
+              <w:t>Ver qué ofrece el mercado</w:t>
+            </w:r>
+          </w:p>
+        </w:tc>
+      </w:tr>
+    </w:tbl>
+    <w:p>
+      <w:pPr>
+        <w:keepNext w:val="0"/>
+        <w:widowControl/>
+        <w:spacing w:lineRule="auto" w:line="240" w:before="80" w:after="200"/>
+        <w:jc w:val="left"/>
+      </w:pPr>
+      <w:r>
+        <w:rPr>
+          <w:rFonts w:ascii="Times New Roman" w:hAnsi="Times New Roman" w:cs="Times New Roman" w:eastAsia="Times New Roman"/>
+          <w:i/>
+          <w:sz w:val="20"/>
+        </w:rPr>
+        <w:t xml:space="preserve">Nota. </w:t>
+      </w:r>
+      <w:r>
+        <w:rPr>
+          <w:rFonts w:ascii="Times New Roman" w:hAnsi="Times New Roman" w:cs="Times New Roman" w:eastAsia="Times New Roman"/>
+          <w:b w:val="0"/>
+          <w:i w:val="0"/>
+          <w:sz w:val="20"/>
+        </w:rPr>
+        <w:t>Elaboración propia. Se revisaron las páginas citadas; no se midió la calidad de los tutoriales.</w:t>
       </w:r>
     </w:p>
     <w:p>

</xml_diff>